<commit_message>
docs: corrección fecha de los hitos
</commit_message>
<xml_diff>
--- a/Documentacion/Planificacion/Lineas Base/LISTA DE HITOS.docx
+++ b/Documentacion/Planificacion/Lineas Base/LISTA DE HITOS.docx
@@ -4,7 +4,7 @@
   <w:body>
     <w:tbl>
       <w:tblPr>
-        <w:tblStyle w:val="Tablaconcuadrcula"/>
+        <w:tblStyle w:val="TableGrid"/>
         <w:tblW w:w="0" w:type="auto"/>
         <w:tblLook w:val="04A0" w:firstRow="1" w:lastRow="0" w:firstColumn="1" w:lastColumn="0" w:noHBand="0" w:noVBand="1"/>
       </w:tblPr>
@@ -198,7 +198,7 @@
     </w:p>
     <w:tbl>
       <w:tblPr>
-        <w:tblStyle w:val="Tablaconcuadrcula"/>
+        <w:tblStyle w:val="TableGrid"/>
         <w:tblW w:w="14425" w:type="dxa"/>
         <w:tblLayout w:type="fixed"/>
         <w:tblLook w:val="04A0" w:firstRow="1" w:lastRow="0" w:firstColumn="1" w:lastColumn="0" w:noHBand="0" w:noVBand="1"/>
@@ -351,8 +351,54 @@
                 <w:bCs/>
                 <w:sz w:val="20"/>
               </w:rPr>
-              <w:t>Entrega del Game Design Document</w:t>
-            </w:r>
+              <w:t xml:space="preserve">Entrega del </w:t>
+            </w:r>
+            <w:proofErr w:type="spellStart"/>
+            <w:r>
+              <w:rPr>
+                <w:rFonts w:ascii="Tahoma" w:hAnsi="Tahoma" w:cs="Tahoma"/>
+                <w:bCs/>
+                <w:sz w:val="20"/>
+              </w:rPr>
+              <w:t>Game</w:t>
+            </w:r>
+            <w:proofErr w:type="spellEnd"/>
+            <w:r>
+              <w:rPr>
+                <w:rFonts w:ascii="Tahoma" w:hAnsi="Tahoma" w:cs="Tahoma"/>
+                <w:bCs/>
+                <w:sz w:val="20"/>
+              </w:rPr>
+              <w:t xml:space="preserve"> </w:t>
+            </w:r>
+            <w:proofErr w:type="spellStart"/>
+            <w:r>
+              <w:rPr>
+                <w:rFonts w:ascii="Tahoma" w:hAnsi="Tahoma" w:cs="Tahoma"/>
+                <w:bCs/>
+                <w:sz w:val="20"/>
+              </w:rPr>
+              <w:t>Design</w:t>
+            </w:r>
+            <w:proofErr w:type="spellEnd"/>
+            <w:r>
+              <w:rPr>
+                <w:rFonts w:ascii="Tahoma" w:hAnsi="Tahoma" w:cs="Tahoma"/>
+                <w:bCs/>
+                <w:sz w:val="20"/>
+              </w:rPr>
+              <w:t xml:space="preserve"> </w:t>
+            </w:r>
+            <w:proofErr w:type="spellStart"/>
+            <w:r>
+              <w:rPr>
+                <w:rFonts w:ascii="Tahoma" w:hAnsi="Tahoma" w:cs="Tahoma"/>
+                <w:bCs/>
+                <w:sz w:val="20"/>
+              </w:rPr>
+              <w:t>Document</w:t>
+            </w:r>
+            <w:proofErr w:type="spellEnd"/>
           </w:p>
         </w:tc>
         <w:tc>
@@ -374,7 +420,61 @@
                 <w:bCs/>
                 <w:sz w:val="20"/>
               </w:rPr>
-              <w:t>Versión final y completa del Game Design Document. Entregables: GDD</w:t>
+              <w:t xml:space="preserve">Versión final y completa del </w:t>
+            </w:r>
+            <w:proofErr w:type="spellStart"/>
+            <w:r>
+              <w:rPr>
+                <w:rFonts w:ascii="Tahoma" w:hAnsi="Tahoma" w:cs="Tahoma"/>
+                <w:bCs/>
+                <w:sz w:val="20"/>
+              </w:rPr>
+              <w:t>Game</w:t>
+            </w:r>
+            <w:proofErr w:type="spellEnd"/>
+            <w:r>
+              <w:rPr>
+                <w:rFonts w:ascii="Tahoma" w:hAnsi="Tahoma" w:cs="Tahoma"/>
+                <w:bCs/>
+                <w:sz w:val="20"/>
+              </w:rPr>
+              <w:t xml:space="preserve"> </w:t>
+            </w:r>
+            <w:proofErr w:type="spellStart"/>
+            <w:r>
+              <w:rPr>
+                <w:rFonts w:ascii="Tahoma" w:hAnsi="Tahoma" w:cs="Tahoma"/>
+                <w:bCs/>
+                <w:sz w:val="20"/>
+              </w:rPr>
+              <w:t>Design</w:t>
+            </w:r>
+            <w:proofErr w:type="spellEnd"/>
+            <w:r>
+              <w:rPr>
+                <w:rFonts w:ascii="Tahoma" w:hAnsi="Tahoma" w:cs="Tahoma"/>
+                <w:bCs/>
+                <w:sz w:val="20"/>
+              </w:rPr>
+              <w:t xml:space="preserve"> </w:t>
+            </w:r>
+            <w:proofErr w:type="spellStart"/>
+            <w:r>
+              <w:rPr>
+                <w:rFonts w:ascii="Tahoma" w:hAnsi="Tahoma" w:cs="Tahoma"/>
+                <w:bCs/>
+                <w:sz w:val="20"/>
+              </w:rPr>
+              <w:t>Document</w:t>
+            </w:r>
+            <w:proofErr w:type="spellEnd"/>
+            <w:r>
+              <w:rPr>
+                <w:rFonts w:ascii="Tahoma" w:hAnsi="Tahoma" w:cs="Tahoma"/>
+                <w:bCs/>
+                <w:sz w:val="20"/>
+              </w:rPr>
+              <w:t>. Entregables: GDD</w:t>
             </w:r>
             <w:r>
               <w:rPr>
@@ -498,8 +598,8 @@
               <w:spacing w:before="120" w:afterAutospacing="0"/>
               <w:rPr>
                 <w:rFonts w:ascii="Tahoma" w:hAnsi="Tahoma" w:cs="Tahoma"/>
-                <w:bCs/>
-                <w:sz w:val="20"/>
+                <w:sz w:val="20"/>
+                <w:szCs w:val="20"/>
               </w:rPr>
             </w:pPr>
             <w:r>
@@ -516,13 +616,13 @@
                 <w:sz w:val="20"/>
                 <w:szCs w:val="20"/>
               </w:rPr>
-              <w:t>2</w:t>
-            </w:r>
-            <w:r>
-              <w:rPr>
-                <w:rFonts w:ascii="Tahoma" w:hAnsi="Tahoma" w:cs="Tahoma"/>
-                <w:bCs/>
-                <w:sz w:val="20"/>
+              <w:t>9</w:t>
+            </w:r>
+            <w:r>
+              <w:rPr>
+                <w:rFonts w:ascii="Tahoma" w:hAnsi="Tahoma" w:cs="Tahoma"/>
+                <w:sz w:val="20"/>
+                <w:szCs w:val="20"/>
               </w:rPr>
               <w:t>/03/2026</w:t>
             </w:r>
@@ -628,7 +728,25 @@
                 <w:bCs/>
                 <w:sz w:val="20"/>
               </w:rPr>
-              <w:t xml:space="preserve">. Entregables: Movimiento lateral, salto, doble salto, dash, sistema base de </w:t>
+              <w:t xml:space="preserve">. Entregables: Movimiento lateral, salto, doble salto, </w:t>
+            </w:r>
+            <w:proofErr w:type="spellStart"/>
+            <w:r>
+              <w:rPr>
+                <w:rFonts w:ascii="Tahoma" w:hAnsi="Tahoma" w:cs="Tahoma"/>
+                <w:bCs/>
+                <w:sz w:val="20"/>
+              </w:rPr>
+              <w:t>dash</w:t>
+            </w:r>
+            <w:proofErr w:type="spellEnd"/>
+            <w:r>
+              <w:rPr>
+                <w:rFonts w:ascii="Tahoma" w:hAnsi="Tahoma" w:cs="Tahoma"/>
+                <w:bCs/>
+                <w:sz w:val="20"/>
+              </w:rPr>
+              <w:t xml:space="preserve">, sistema base de </w:t>
             </w:r>
             <w:r>
               <w:rPr>
@@ -683,7 +801,15 @@
                 <w:sz w:val="20"/>
                 <w:szCs w:val="20"/>
               </w:rPr>
-              <w:t>14</w:t>
+              <w:t>1</w:t>
+            </w:r>
+            <w:r>
+              <w:rPr>
+                <w:rFonts w:ascii="Tahoma" w:hAnsi="Tahoma" w:cs="Tahoma"/>
+                <w:sz w:val="20"/>
+                <w:szCs w:val="20"/>
+              </w:rPr>
+              <w:t>6</w:t>
             </w:r>
             <w:r>
               <w:rPr>
@@ -771,7 +897,43 @@
                 <w:bCs/>
                 <w:sz w:val="20"/>
               </w:rPr>
-              <w:t>Los enemigos reaccionan al jugador. Entregables: IA agresiva básica (terrestre y voladora), sistemas de spawn/despawn y daño por contacto.</w:t>
+              <w:t xml:space="preserve">Los enemigos reaccionan al jugador. Entregables: IA agresiva básica (terrestre y voladora), sistemas de </w:t>
+            </w:r>
+            <w:proofErr w:type="spellStart"/>
+            <w:r>
+              <w:rPr>
+                <w:rFonts w:ascii="Tahoma" w:hAnsi="Tahoma" w:cs="Tahoma"/>
+                <w:bCs/>
+                <w:sz w:val="20"/>
+              </w:rPr>
+              <w:t>spawn</w:t>
+            </w:r>
+            <w:proofErr w:type="spellEnd"/>
+            <w:r>
+              <w:rPr>
+                <w:rFonts w:ascii="Tahoma" w:hAnsi="Tahoma" w:cs="Tahoma"/>
+                <w:bCs/>
+                <w:sz w:val="20"/>
+              </w:rPr>
+              <w:t>/</w:t>
+            </w:r>
+            <w:proofErr w:type="spellStart"/>
+            <w:r>
+              <w:rPr>
+                <w:rFonts w:ascii="Tahoma" w:hAnsi="Tahoma" w:cs="Tahoma"/>
+                <w:bCs/>
+                <w:sz w:val="20"/>
+              </w:rPr>
+              <w:t>despawn</w:t>
+            </w:r>
+            <w:proofErr w:type="spellEnd"/>
+            <w:r>
+              <w:rPr>
+                <w:rFonts w:ascii="Tahoma" w:hAnsi="Tahoma" w:cs="Tahoma"/>
+                <w:bCs/>
+                <w:sz w:val="20"/>
+              </w:rPr>
+              <w:t xml:space="preserve"> y daño por contacto.</w:t>
             </w:r>
           </w:p>
         </w:tc>
@@ -802,7 +964,7 @@
                 <w:sz w:val="20"/>
                 <w:szCs w:val="20"/>
               </w:rPr>
-              <w:t>2</w:t>
+              <w:t>3</w:t>
             </w:r>
             <w:r>
               <w:rPr>
@@ -913,7 +1075,7 @@
                 <w:sz w:val="20"/>
                 <w:szCs w:val="20"/>
               </w:rPr>
-              <w:t>10</w:t>
+              <w:t>13</w:t>
             </w:r>
             <w:r>
               <w:rPr>
@@ -1040,7 +1202,7 @@
                 <w:sz w:val="20"/>
                 <w:szCs w:val="20"/>
               </w:rPr>
-              <w:t>1</w:t>
+              <w:t>2</w:t>
             </w:r>
             <w:r>
               <w:rPr>
@@ -1113,7 +1275,25 @@
                 <w:bCs/>
                 <w:sz w:val="20"/>
               </w:rPr>
-              <w:t>Estructura de Niveles (Greybox Completo)</w:t>
+              <w:t>Estructura de Niveles (</w:t>
+            </w:r>
+            <w:proofErr w:type="spellStart"/>
+            <w:r>
+              <w:rPr>
+                <w:rFonts w:ascii="Tahoma" w:hAnsi="Tahoma" w:cs="Tahoma"/>
+                <w:bCs/>
+                <w:sz w:val="20"/>
+              </w:rPr>
+              <w:t>Greybox</w:t>
+            </w:r>
+            <w:proofErr w:type="spellEnd"/>
+            <w:r>
+              <w:rPr>
+                <w:rFonts w:ascii="Tahoma" w:hAnsi="Tahoma" w:cs="Tahoma"/>
+                <w:bCs/>
+                <w:sz w:val="20"/>
+              </w:rPr>
+              <w:t xml:space="preserve"> Completo)</w:t>
             </w:r>
           </w:p>
         </w:tc>
@@ -1136,7 +1316,61 @@
                 <w:bCs/>
                 <w:sz w:val="20"/>
               </w:rPr>
-              <w:t>El juego se puede recorrer de principio a fin sin arte final. Entregables: Layout de los 4 niveles, plataformas, etc y triggers de arenas de jefes colocados.</w:t>
+              <w:t xml:space="preserve">El juego se puede recorrer de principio a fin sin arte final. Entregables: </w:t>
+            </w:r>
+            <w:proofErr w:type="spellStart"/>
+            <w:r>
+              <w:rPr>
+                <w:rFonts w:ascii="Tahoma" w:hAnsi="Tahoma" w:cs="Tahoma"/>
+                <w:bCs/>
+                <w:sz w:val="20"/>
+              </w:rPr>
+              <w:t>Layout</w:t>
+            </w:r>
+            <w:proofErr w:type="spellEnd"/>
+            <w:r>
+              <w:rPr>
+                <w:rFonts w:ascii="Tahoma" w:hAnsi="Tahoma" w:cs="Tahoma"/>
+                <w:bCs/>
+                <w:sz w:val="20"/>
+              </w:rPr>
+              <w:t xml:space="preserve"> de los 4 niveles, plataformas, </w:t>
+            </w:r>
+            <w:proofErr w:type="spellStart"/>
+            <w:r>
+              <w:rPr>
+                <w:rFonts w:ascii="Tahoma" w:hAnsi="Tahoma" w:cs="Tahoma"/>
+                <w:bCs/>
+                <w:sz w:val="20"/>
+              </w:rPr>
+              <w:t>etc</w:t>
+            </w:r>
+            <w:proofErr w:type="spellEnd"/>
+            <w:r>
+              <w:rPr>
+                <w:rFonts w:ascii="Tahoma" w:hAnsi="Tahoma" w:cs="Tahoma"/>
+                <w:bCs/>
+                <w:sz w:val="20"/>
+              </w:rPr>
+              <w:t xml:space="preserve"> y </w:t>
+            </w:r>
+            <w:proofErr w:type="spellStart"/>
+            <w:r>
+              <w:rPr>
+                <w:rFonts w:ascii="Tahoma" w:hAnsi="Tahoma" w:cs="Tahoma"/>
+                <w:bCs/>
+                <w:sz w:val="20"/>
+              </w:rPr>
+              <w:t>triggers</w:t>
+            </w:r>
+            <w:proofErr w:type="spellEnd"/>
+            <w:r>
+              <w:rPr>
+                <w:rFonts w:ascii="Tahoma" w:hAnsi="Tahoma" w:cs="Tahoma"/>
+                <w:bCs/>
+                <w:sz w:val="20"/>
+              </w:rPr>
+              <w:t xml:space="preserve"> de arenas de jefes colocados.</w:t>
             </w:r>
           </w:p>
         </w:tc>
@@ -1159,15 +1393,7 @@
                 <w:sz w:val="20"/>
                 <w:szCs w:val="20"/>
               </w:rPr>
-              <w:t>2</w:t>
-            </w:r>
-            <w:r>
-              <w:rPr>
-                <w:rFonts w:ascii="Tahoma" w:hAnsi="Tahoma" w:cs="Tahoma"/>
-                <w:sz w:val="20"/>
-                <w:szCs w:val="20"/>
-              </w:rPr>
-              <w:t>2</w:t>
+              <w:t>30</w:t>
             </w:r>
             <w:r>
               <w:rPr>
@@ -1217,7 +1443,6 @@
                 <w:b/>
                 <w:sz w:val="20"/>
               </w:rPr>
-              <w:lastRenderedPageBreak/>
               <w:t>H</w:t>
             </w:r>
             <w:r>
@@ -1304,7 +1529,25 @@
                 <w:bCs/>
                 <w:sz w:val="20"/>
               </w:rPr>
-              <w:t>. Entregables: Tilemaps, fondos, animaciones del jugador y enemigos integrados.</w:t>
+              <w:t xml:space="preserve">. Entregables: </w:t>
+            </w:r>
+            <w:proofErr w:type="spellStart"/>
+            <w:r>
+              <w:rPr>
+                <w:rFonts w:ascii="Tahoma" w:hAnsi="Tahoma" w:cs="Tahoma"/>
+                <w:bCs/>
+                <w:sz w:val="20"/>
+              </w:rPr>
+              <w:t>Tilemaps</w:t>
+            </w:r>
+            <w:proofErr w:type="spellEnd"/>
+            <w:r>
+              <w:rPr>
+                <w:rFonts w:ascii="Tahoma" w:hAnsi="Tahoma" w:cs="Tahoma"/>
+                <w:bCs/>
+                <w:sz w:val="20"/>
+              </w:rPr>
+              <w:t>, fondos, animaciones del jugador y enemigos integrados.</w:t>
             </w:r>
           </w:p>
         </w:tc>
@@ -1327,23 +1570,39 @@
                 <w:sz w:val="20"/>
                 <w:szCs w:val="20"/>
               </w:rPr>
-              <w:t>2</w:t>
-            </w:r>
-            <w:r>
-              <w:rPr>
-                <w:rFonts w:ascii="Tahoma" w:hAnsi="Tahoma" w:cs="Tahoma"/>
-                <w:sz w:val="20"/>
-                <w:szCs w:val="20"/>
-              </w:rPr>
-              <w:t>6</w:t>
-            </w:r>
-            <w:r>
-              <w:rPr>
-                <w:rFonts w:ascii="Tahoma" w:hAnsi="Tahoma" w:cs="Tahoma"/>
-                <w:sz w:val="20"/>
-                <w:szCs w:val="20"/>
-              </w:rPr>
-              <w:t>/04/2026</w:t>
+              <w:t>0</w:t>
+            </w:r>
+            <w:r>
+              <w:rPr>
+                <w:rFonts w:ascii="Tahoma" w:hAnsi="Tahoma" w:cs="Tahoma"/>
+                <w:sz w:val="20"/>
+                <w:szCs w:val="20"/>
+              </w:rPr>
+              <w:t>4</w:t>
+            </w:r>
+            <w:r>
+              <w:rPr>
+                <w:rFonts w:ascii="Tahoma" w:hAnsi="Tahoma" w:cs="Tahoma"/>
+                <w:sz w:val="20"/>
+                <w:szCs w:val="20"/>
+              </w:rPr>
+              <w:t>/0</w:t>
+            </w:r>
+            <w:r>
+              <w:rPr>
+                <w:rFonts w:ascii="Tahoma" w:hAnsi="Tahoma" w:cs="Tahoma"/>
+                <w:sz w:val="20"/>
+                <w:szCs w:val="20"/>
+              </w:rPr>
+              <w:t>5</w:t>
+            </w:r>
+            <w:r>
+              <w:rPr>
+                <w:rFonts w:ascii="Tahoma" w:hAnsi="Tahoma" w:cs="Tahoma"/>
+                <w:sz w:val="20"/>
+                <w:szCs w:val="20"/>
+              </w:rPr>
+              <w:t>/2026</w:t>
             </w:r>
           </w:p>
         </w:tc>
@@ -1462,7 +1721,39 @@
                 <w:sz w:val="20"/>
                 <w:szCs w:val="20"/>
               </w:rPr>
-              <w:t>29/04/2026</w:t>
+              <w:t>0</w:t>
+            </w:r>
+            <w:r>
+              <w:rPr>
+                <w:rFonts w:ascii="Tahoma" w:hAnsi="Tahoma" w:cs="Tahoma"/>
+                <w:sz w:val="20"/>
+                <w:szCs w:val="20"/>
+              </w:rPr>
+              <w:t>8</w:t>
+            </w:r>
+            <w:r>
+              <w:rPr>
+                <w:rFonts w:ascii="Tahoma" w:hAnsi="Tahoma" w:cs="Tahoma"/>
+                <w:sz w:val="20"/>
+                <w:szCs w:val="20"/>
+              </w:rPr>
+              <w:t>/0</w:t>
+            </w:r>
+            <w:r>
+              <w:rPr>
+                <w:rFonts w:ascii="Tahoma" w:hAnsi="Tahoma" w:cs="Tahoma"/>
+                <w:sz w:val="20"/>
+                <w:szCs w:val="20"/>
+              </w:rPr>
+              <w:t>5</w:t>
+            </w:r>
+            <w:r>
+              <w:rPr>
+                <w:rFonts w:ascii="Tahoma" w:hAnsi="Tahoma" w:cs="Tahoma"/>
+                <w:sz w:val="20"/>
+                <w:szCs w:val="20"/>
+              </w:rPr>
+              <w:t>/2026</w:t>
             </w:r>
           </w:p>
         </w:tc>
@@ -1505,13 +1796,23 @@
                 <w:sz w:val="20"/>
               </w:rPr>
             </w:pPr>
-            <w:r>
-              <w:rPr>
-                <w:rFonts w:ascii="Tahoma" w:hAnsi="Tahoma" w:cs="Tahoma"/>
-                <w:bCs/>
-                <w:sz w:val="20"/>
-              </w:rPr>
-              <w:t>Leaderboard Integrado</w:t>
+            <w:proofErr w:type="spellStart"/>
+            <w:r>
+              <w:rPr>
+                <w:rFonts w:ascii="Tahoma" w:hAnsi="Tahoma" w:cs="Tahoma"/>
+                <w:bCs/>
+                <w:sz w:val="20"/>
+              </w:rPr>
+              <w:t>Leaderboard</w:t>
+            </w:r>
+            <w:proofErr w:type="spellEnd"/>
+            <w:r>
+              <w:rPr>
+                <w:rFonts w:ascii="Tahoma" w:hAnsi="Tahoma" w:cs="Tahoma"/>
+                <w:bCs/>
+                <w:sz w:val="20"/>
+              </w:rPr>
+              <w:t xml:space="preserve"> Integrado</w:t>
             </w:r>
           </w:p>
         </w:tc>
@@ -1542,8 +1843,18 @@
                 <w:bCs/>
                 <w:sz w:val="20"/>
               </w:rPr>
-              <w:t>: Leaderboard</w:t>
-            </w:r>
+              <w:t xml:space="preserve">: </w:t>
+            </w:r>
+            <w:proofErr w:type="spellStart"/>
+            <w:r>
+              <w:rPr>
+                <w:rFonts w:ascii="Tahoma" w:hAnsi="Tahoma" w:cs="Tahoma"/>
+                <w:bCs/>
+                <w:sz w:val="20"/>
+              </w:rPr>
+              <w:t>Leaderboard</w:t>
+            </w:r>
+            <w:proofErr w:type="spellEnd"/>
             <w:r>
               <w:rPr>
                 <w:rFonts w:ascii="Tahoma" w:hAnsi="Tahoma" w:cs="Tahoma"/>
@@ -1573,7 +1884,15 @@
                 <w:sz w:val="20"/>
                 <w:szCs w:val="20"/>
               </w:rPr>
-              <w:t>04/05/2026</w:t>
+              <w:t>11</w:t>
+            </w:r>
+            <w:r>
+              <w:rPr>
+                <w:rFonts w:ascii="Tahoma" w:hAnsi="Tahoma" w:cs="Tahoma"/>
+                <w:sz w:val="20"/>
+                <w:szCs w:val="20"/>
+              </w:rPr>
+              <w:t>/05/2026</w:t>
             </w:r>
           </w:p>
         </w:tc>
@@ -1692,7 +2011,15 @@
                 <w:sz w:val="20"/>
                 <w:szCs w:val="20"/>
               </w:rPr>
-              <w:t>08/05/2026</w:t>
+              <w:t>14</w:t>
+            </w:r>
+            <w:r>
+              <w:rPr>
+                <w:rFonts w:ascii="Tahoma" w:hAnsi="Tahoma" w:cs="Tahoma"/>
+                <w:sz w:val="20"/>
+                <w:szCs w:val="20"/>
+              </w:rPr>
+              <w:t>/05/2026</w:t>
             </w:r>
           </w:p>
         </w:tc>
@@ -1749,7 +2076,31 @@
                 <w:sz w:val="20"/>
                 <w:szCs w:val="20"/>
               </w:rPr>
-              <w:t>Fase de pruebas terminada</w:t>
+              <w:t xml:space="preserve">Fase de pruebas </w:t>
+            </w:r>
+            <w:r>
+              <w:rPr>
+                <w:rFonts w:ascii="Tahoma" w:hAnsi="Tahoma" w:cs="Tahoma"/>
+                <w:sz w:val="20"/>
+                <w:szCs w:val="20"/>
+              </w:rPr>
+              <w:t>final</w:t>
+            </w:r>
+            <w:r>
+              <w:rPr>
+                <w:rFonts w:ascii="Tahoma" w:hAnsi="Tahoma" w:cs="Tahoma"/>
+                <w:sz w:val="20"/>
+                <w:szCs w:val="20"/>
+              </w:rPr>
+              <w:t xml:space="preserve"> </w:t>
+            </w:r>
+            <w:r>
+              <w:rPr>
+                <w:rFonts w:ascii="Tahoma" w:hAnsi="Tahoma" w:cs="Tahoma"/>
+                <w:sz w:val="20"/>
+                <w:szCs w:val="20"/>
+              </w:rPr>
+              <w:t>terminada</w:t>
             </w:r>
           </w:p>
         </w:tc>
@@ -1780,15 +2131,161 @@
                 <w:sz w:val="20"/>
                 <w:szCs w:val="20"/>
               </w:rPr>
-              <w:t>L</w:t>
-            </w:r>
-            <w:r>
-              <w:rPr>
-                <w:rFonts w:ascii="Tahoma" w:hAnsi="Tahoma" w:cs="Tahoma"/>
-                <w:sz w:val="20"/>
-                <w:szCs w:val="20"/>
-              </w:rPr>
-              <w:t xml:space="preserve">a fase de pruebas funcionales, playtesting y optimización para asegurar </w:t>
+              <w:t xml:space="preserve">Empieza la </w:t>
+            </w:r>
+            <w:r>
+              <w:rPr>
+                <w:rFonts w:ascii="Tahoma" w:hAnsi="Tahoma" w:cs="Tahoma"/>
+                <w:sz w:val="20"/>
+                <w:szCs w:val="20"/>
+              </w:rPr>
+              <w:t xml:space="preserve">fase de pruebas </w:t>
+            </w:r>
+            <w:r>
+              <w:rPr>
+                <w:rFonts w:ascii="Tahoma" w:hAnsi="Tahoma" w:cs="Tahoma"/>
+                <w:sz w:val="20"/>
+                <w:szCs w:val="20"/>
+              </w:rPr>
+              <w:t>definitiva</w:t>
+            </w:r>
+            <w:r>
+              <w:rPr>
+                <w:rFonts w:ascii="Tahoma" w:hAnsi="Tahoma" w:cs="Tahoma"/>
+                <w:sz w:val="20"/>
+                <w:szCs w:val="20"/>
+              </w:rPr>
+              <w:t xml:space="preserve">, </w:t>
+            </w:r>
+            <w:r>
+              <w:rPr>
+                <w:rFonts w:ascii="Tahoma" w:hAnsi="Tahoma" w:cs="Tahoma"/>
+                <w:sz w:val="20"/>
+                <w:szCs w:val="20"/>
+              </w:rPr>
+              <w:t xml:space="preserve">que </w:t>
+            </w:r>
+            <w:r>
+              <w:rPr>
+                <w:rFonts w:ascii="Tahoma" w:hAnsi="Tahoma" w:cs="Tahoma"/>
+                <w:sz w:val="20"/>
+                <w:szCs w:val="20"/>
+              </w:rPr>
+              <w:t xml:space="preserve">asegura que </w:t>
+            </w:r>
+            <w:r>
+              <w:rPr>
+                <w:rFonts w:ascii="Tahoma" w:hAnsi="Tahoma" w:cs="Tahoma"/>
+                <w:sz w:val="20"/>
+                <w:szCs w:val="20"/>
+              </w:rPr>
+              <w:t xml:space="preserve">el juego </w:t>
+            </w:r>
+            <w:r>
+              <w:rPr>
+                <w:rFonts w:ascii="Tahoma" w:hAnsi="Tahoma" w:cs="Tahoma"/>
+                <w:sz w:val="20"/>
+                <w:szCs w:val="20"/>
+              </w:rPr>
+              <w:t xml:space="preserve">esté </w:t>
+            </w:r>
+            <w:r>
+              <w:rPr>
+                <w:rFonts w:ascii="Tahoma" w:hAnsi="Tahoma" w:cs="Tahoma"/>
+                <w:sz w:val="20"/>
+                <w:szCs w:val="20"/>
+              </w:rPr>
+              <w:t>completamente terminado</w:t>
+            </w:r>
+            <w:r>
+              <w:rPr>
+                <w:rFonts w:ascii="Tahoma" w:hAnsi="Tahoma" w:cs="Tahoma"/>
+                <w:sz w:val="20"/>
+                <w:szCs w:val="20"/>
+              </w:rPr>
+              <w:t xml:space="preserve"> </w:t>
+            </w:r>
+            <w:r>
+              <w:rPr>
+                <w:rFonts w:ascii="Tahoma" w:hAnsi="Tahoma" w:cs="Tahoma"/>
+                <w:sz w:val="20"/>
+                <w:szCs w:val="20"/>
+              </w:rPr>
+              <w:t xml:space="preserve">y </w:t>
+            </w:r>
+            <w:r>
+              <w:rPr>
+                <w:rFonts w:ascii="Tahoma" w:hAnsi="Tahoma" w:cs="Tahoma"/>
+                <w:sz w:val="20"/>
+                <w:szCs w:val="20"/>
+              </w:rPr>
+              <w:t>confirma</w:t>
+            </w:r>
+            <w:r>
+              <w:rPr>
+                <w:rFonts w:ascii="Tahoma" w:hAnsi="Tahoma" w:cs="Tahoma"/>
+                <w:sz w:val="20"/>
+                <w:szCs w:val="20"/>
+              </w:rPr>
+              <w:t xml:space="preserve"> </w:t>
+            </w:r>
+            <w:r>
+              <w:rPr>
+                <w:rFonts w:ascii="Tahoma" w:hAnsi="Tahoma" w:cs="Tahoma"/>
+                <w:sz w:val="20"/>
+                <w:szCs w:val="20"/>
+              </w:rPr>
+              <w:t xml:space="preserve">si </w:t>
+            </w:r>
+            <w:r>
+              <w:rPr>
+                <w:rFonts w:ascii="Tahoma" w:hAnsi="Tahoma" w:cs="Tahoma"/>
+                <w:sz w:val="20"/>
+                <w:szCs w:val="20"/>
+              </w:rPr>
+              <w:t>es entregable</w:t>
+            </w:r>
+            <w:r>
+              <w:rPr>
+                <w:rFonts w:ascii="Tahoma" w:hAnsi="Tahoma" w:cs="Tahoma"/>
+                <w:sz w:val="20"/>
+                <w:szCs w:val="20"/>
+              </w:rPr>
+              <w:t>. Incluya pruebas</w:t>
+            </w:r>
+            <w:r>
+              <w:rPr>
+                <w:rFonts w:ascii="Tahoma" w:hAnsi="Tahoma" w:cs="Tahoma"/>
+                <w:sz w:val="20"/>
+                <w:szCs w:val="20"/>
+              </w:rPr>
+              <w:t xml:space="preserve"> </w:t>
+            </w:r>
+            <w:r>
+              <w:rPr>
+                <w:rFonts w:ascii="Tahoma" w:hAnsi="Tahoma" w:cs="Tahoma"/>
+                <w:sz w:val="20"/>
+                <w:szCs w:val="20"/>
+              </w:rPr>
+              <w:t xml:space="preserve">funcionales, </w:t>
+            </w:r>
+            <w:proofErr w:type="spellStart"/>
+            <w:r>
+              <w:rPr>
+                <w:rFonts w:ascii="Tahoma" w:hAnsi="Tahoma" w:cs="Tahoma"/>
+                <w:sz w:val="20"/>
+                <w:szCs w:val="20"/>
+              </w:rPr>
+              <w:t>playtesting</w:t>
+            </w:r>
+            <w:proofErr w:type="spellEnd"/>
+            <w:r>
+              <w:rPr>
+                <w:rFonts w:ascii="Tahoma" w:hAnsi="Tahoma" w:cs="Tahoma"/>
+                <w:sz w:val="20"/>
+                <w:szCs w:val="20"/>
+              </w:rPr>
+              <w:t xml:space="preserve"> y optimización para asegurar </w:t>
             </w:r>
             <w:r>
               <w:rPr>
@@ -1827,7 +2324,15 @@
                 <w:sz w:val="20"/>
                 <w:szCs w:val="20"/>
               </w:rPr>
-              <w:t>15</w:t>
+              <w:t>1</w:t>
+            </w:r>
+            <w:r>
+              <w:rPr>
+                <w:rFonts w:ascii="Tahoma" w:hAnsi="Tahoma" w:cs="Tahoma"/>
+                <w:sz w:val="20"/>
+                <w:szCs w:val="20"/>
+              </w:rPr>
+              <w:t>8</w:t>
             </w:r>
             <w:r>
               <w:rPr>
@@ -1915,7 +2420,25 @@
                 <w:bCs/>
                 <w:sz w:val="20"/>
               </w:rPr>
-              <w:t>Fin del desarrollo. Entregables: Build jugable ejecutable sin errores bloqueantes (.exe), Memoria del TFG y Manuales de usuario terminados.</w:t>
+              <w:t xml:space="preserve">Fin del desarrollo. Entregables: </w:t>
+            </w:r>
+            <w:proofErr w:type="spellStart"/>
+            <w:r>
+              <w:rPr>
+                <w:rFonts w:ascii="Tahoma" w:hAnsi="Tahoma" w:cs="Tahoma"/>
+                <w:bCs/>
+                <w:sz w:val="20"/>
+              </w:rPr>
+              <w:t>Build</w:t>
+            </w:r>
+            <w:proofErr w:type="spellEnd"/>
+            <w:r>
+              <w:rPr>
+                <w:rFonts w:ascii="Tahoma" w:hAnsi="Tahoma" w:cs="Tahoma"/>
+                <w:bCs/>
+                <w:sz w:val="20"/>
+              </w:rPr>
+              <w:t xml:space="preserve"> jugable ejecutable sin errores bloqueantes (.exe), Memoria del TFG y Manuales de usuario terminados.</w:t>
             </w:r>
           </w:p>
         </w:tc>
@@ -1952,8 +2475,8 @@
       </w:pPr>
     </w:p>
     <w:sectPr>
-      <w:headerReference w:type="default" r:id="rId7"/>
-      <w:footerReference w:type="default" r:id="rId8"/>
+      <w:headerReference w:type="default" r:id="rId6"/>
+      <w:footerReference w:type="default" r:id="rId7"/>
       <w:pgSz w:w="16838" w:h="11906" w:orient="landscape"/>
       <w:pgMar w:top="1701" w:right="1417" w:bottom="1701" w:left="1417" w:header="708" w:footer="708" w:gutter="0"/>
       <w:cols w:space="708"/>
@@ -2022,7 +2545,7 @@
         </w:tcPr>
         <w:p>
           <w:pPr>
-            <w:pStyle w:val="Encabezado"/>
+            <w:pStyle w:val="Header"/>
             <w:rPr>
               <w:caps/>
               <w:sz w:val="18"/>
@@ -2041,7 +2564,7 @@
         </w:tcPr>
         <w:p>
           <w:pPr>
-            <w:pStyle w:val="Encabezado"/>
+            <w:pStyle w:val="Header"/>
             <w:jc w:val="right"/>
             <w:rPr>
               <w:caps/>
@@ -2062,7 +2585,7 @@
         </w:tcPr>
         <w:p>
           <w:pPr>
-            <w:pStyle w:val="Piedepgina"/>
+            <w:pStyle w:val="Footer"/>
             <w:rPr>
               <w:caps/>
               <w:color w:val="808080" w:themeColor="background1" w:themeShade="80"/>
@@ -2079,7 +2602,7 @@
         </w:tcPr>
         <w:p>
           <w:pPr>
-            <w:pStyle w:val="Piedepgina"/>
+            <w:pStyle w:val="Footer"/>
             <w:jc w:val="right"/>
             <w:rPr>
               <w:caps/>
@@ -2180,7 +2703,7 @@
   </w:tbl>
   <w:p>
     <w:pPr>
-      <w:pStyle w:val="Piedepgina"/>
+      <w:pStyle w:val="Footer"/>
     </w:pPr>
   </w:p>
 </w:ftr>
@@ -2215,7 +2738,7 @@
 <w:hdr xmlns:wpc="http://schemas.microsoft.com/office/word/2010/wordprocessingCanvas" xmlns:cx="http://schemas.microsoft.com/office/drawing/2014/chartex" xmlns:cx1="http://schemas.microsoft.com/office/drawing/2015/9/8/chartex" xmlns:cx2="http://schemas.microsoft.com/office/drawing/2015/10/21/chartex" xmlns:cx3="http://schemas.microsoft.com/office/drawing/2016/5/9/chartex" xmlns:cx4="http://schemas.microsoft.com/office/drawing/2016/5/10/chartex" xmlns:cx5="http://schemas.microsoft.com/office/drawing/2016/5/11/chartex" xmlns:cx6="http://schemas.microsoft.com/office/drawing/2016/5/12/chartex" xmlns:cx7="http://schemas.microsoft.com/office/drawing/2016/5/13/chartex" xmlns:cx8="http://schemas.microsoft.com/office/drawing/2016/5/14/chartex" xmlns:mc="http://schemas.openxmlformats.org/markup-compatibility/2006" xmlns:aink="http://schemas.microsoft.com/office/drawing/2016/ink" xmlns:am3d="http://schemas.microsoft.com/office/drawing/2017/model3d" xmlns:o="urn:schemas-microsoft-com:office:office" xmlns:oel="http://schemas.microsoft.com/office/2019/extlst" xmlns:r="http://schemas.openxmlformats.org/officeDocument/2006/relationships" xmlns:m="http://schemas.openxmlformats.org/officeDocument/2006/math" xmlns:v="urn:schemas-microsoft-com:vml" xmlns:wp14="http://schemas.microsoft.com/office/word/2010/wordprocessingDrawing" xmlns:wp="http://schemas.openxmlformats.org/drawingml/2006/wordprocessingDrawing" xmlns:w10="urn:schemas-microsoft-com:office:word" xmlns:w="http://schemas.openxmlformats.org/wordprocessingml/2006/main" xmlns:w14="http://schemas.microsoft.com/office/word/2010/wordml" xmlns:w15="http://schemas.microsoft.com/office/word/2012/wordml" xmlns:w16cex="http://schemas.microsoft.com/office/word/2018/wordml/cex" xmlns:w16cid="http://schemas.microsoft.com/office/word/2016/wordml/cid" xmlns:w16="http://schemas.microsoft.com/office/word/2018/wordml" xmlns:w16du="http://schemas.microsoft.com/office/word/2023/wordml/word16du" xmlns:w16sdtdh="http://schemas.microsoft.com/office/word/2020/wordml/sdtdatahash" xmlns:w16sdtfl="http://schemas.microsoft.com/office/word/2024/wordml/sdtformatlock" xmlns:w16se="http://schemas.microsoft.com/office/word/2015/wordml/symex" xmlns:wpg="http://schemas.microsoft.com/office/word/2010/wordprocessingGroup" xmlns:wpi="http://schemas.microsoft.com/office/word/2010/wordprocessingInk" xmlns:wne="http://schemas.microsoft.com/office/word/2006/wordml" xmlns:wps="http://schemas.microsoft.com/office/word/2010/wordprocessingShape" mc:Ignorable="w14 w15 w16se w16cid w16 w16cex w16sdtdh w16sdtfl w16du wp14">
   <w:p>
     <w:pPr>
-      <w:pStyle w:val="Encabezado"/>
+      <w:pStyle w:val="Header"/>
     </w:pPr>
     <w:r>
       <w:rPr>
@@ -2296,11 +2819,10 @@
                             <w:dataBinding w:prefixMappings="xmlns:ns0='http://purl.org/dc/elements/1.1/' xmlns:ns1='http://schemas.openxmlformats.org/package/2006/metadata/core-properties' " w:xpath="/ns1:coreProperties[1]/ns0:title[1]" w:storeItemID="{6C3C8BC8-F283-45AE-878A-BAB7291924A1}"/>
                             <w:text/>
                           </w:sdtPr>
-                          <w:sdtEndPr/>
                           <w:sdtContent>
                             <w:p>
                               <w:pPr>
-                                <w:pStyle w:val="Encabezado"/>
+                                <w:pStyle w:val="Header"/>
                                 <w:jc w:val="center"/>
                                 <w:rPr>
                                   <w:caps/>
@@ -2338,9 +2860,9 @@
             </wp:anchor>
           </w:drawing>
         </mc:Choice>
-        <mc:Fallback>
+        <mc:Fallback xmlns:arto="http://schemas.microsoft.com/office/word/2006/arto" xmlns:a="http://schemas.openxmlformats.org/drawingml/2006/main">
           <w:pict>
-            <v:rect w14:anchorId="505419E7" id="Rectángulo 200" o:spid="_x0000_s1026" style="position:absolute;margin-left:0;margin-top:0;width:468.5pt;height:21.3pt;z-index:-251658240;visibility:visible;mso-wrap-style:square;mso-width-percent:1000;mso-height-percent:27;mso-top-percent:45;mso-wrap-distance-left:9.35pt;mso-wrap-distance-top:0;mso-wrap-distance-right:9.35pt;mso-wrap-distance-bottom:0;mso-position-horizontal:center;mso-position-horizontal-relative:margin;mso-position-vertical-relative:page;mso-width-percent:1000;mso-height-percent:27;mso-top-percent:45;mso-width-relative:margin;mso-height-relative:page;v-text-anchor:middle" o:gfxdata="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" o:allowoverlap="f" fillcolor="#156082 [3204]" stroked="f" strokeweight="1.5pt">
+            <v:rect id="Rectángulo 200" style="position:absolute;margin-left:0;margin-top:0;width:468.5pt;height:21.3pt;z-index:-251658240;visibility:visible;mso-wrap-style:square;mso-width-percent:1000;mso-height-percent:27;mso-top-percent:45;mso-wrap-distance-left:9.35pt;mso-wrap-distance-top:0;mso-wrap-distance-right:9.35pt;mso-wrap-distance-bottom:0;mso-position-horizontal:center;mso-position-horizontal-relative:margin;mso-position-vertical-relative:page;mso-width-percent:1000;mso-height-percent:27;mso-top-percent:45;mso-width-relative:margin;mso-height-relative:page;v-text-anchor:middle" o:spid="_x0000_s1026" o:allowoverlap="f" fillcolor="#156082 [3204]" stroked="f" strokeweight="1.5pt" w14:anchorId="505419E7" o:gfxdata="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">
               <v:textbox style="mso-fit-shape-to-text:t">
                 <w:txbxContent>
                   <w:sdt>
@@ -2356,11 +2878,10 @@
                       <w:dataBinding w:prefixMappings="xmlns:ns0='http://purl.org/dc/elements/1.1/' xmlns:ns1='http://schemas.openxmlformats.org/package/2006/metadata/core-properties' " w:xpath="/ns1:coreProperties[1]/ns0:title[1]" w:storeItemID="{6C3C8BC8-F283-45AE-878A-BAB7291924A1}"/>
                       <w:text/>
                     </w:sdtPr>
-                    <w:sdtEndPr/>
                     <w:sdtContent>
                       <w:p>
                         <w:pPr>
-                          <w:pStyle w:val="Encabezado"/>
+                          <w:pStyle w:val="Header"/>
                           <w:jc w:val="center"/>
                           <w:rPr>
                             <w:caps/>
@@ -2392,14 +2913,14 @@
 
 <file path=word/intelligence2.xml><?xml version="1.0" encoding="utf-8"?>
 <int2:intelligence xmlns:int2="http://schemas.microsoft.com/office/intelligence/2020/intelligence" xmlns:oel="http://schemas.microsoft.com/office/2019/extlst">
-  <int2:observations/>
+  <int2:observations>
+    <int2:textHash int2:hashCode="PGbCLpC8Bq5zlb" int2:id="oGe3e2dw">
+      <int2:state int2:value="Rejected" int2:type="spell"/>
+    </int2:textHash>
+  </int2:observations>
   <int2:intelligenceSettings/>
   <int2:onDemandWorkflows/>
 </int2:intelligence>
-</file>
-
-<file path=word/numbering.xml><?xml version="1.0" encoding="utf-8"?>
-<w:numbering xmlns:wpc="http://schemas.microsoft.com/office/word/2010/wordprocessingCanvas" xmlns:cx="http://schemas.microsoft.com/office/drawing/2014/chartex" xmlns:cx1="http://schemas.microsoft.com/office/drawing/2015/9/8/chartex" xmlns:cx2="http://schemas.microsoft.com/office/drawing/2015/10/21/chartex" xmlns:cx3="http://schemas.microsoft.com/office/drawing/2016/5/9/chartex" xmlns:cx4="http://schemas.microsoft.com/office/drawing/2016/5/10/chartex" xmlns:cx5="http://schemas.microsoft.com/office/drawing/2016/5/11/chartex" xmlns:cx6="http://schemas.microsoft.com/office/drawing/2016/5/12/chartex" xmlns:cx7="http://schemas.microsoft.com/office/drawing/2016/5/13/chartex" xmlns:cx8="http://schemas.microsoft.com/office/drawing/2016/5/14/chartex" xmlns:mc="http://schemas.openxmlformats.org/markup-compatibility/2006" xmlns:aink="http://schemas.microsoft.com/office/drawing/2016/ink" xmlns:am3d="http://schemas.microsoft.com/office/drawing/2017/model3d" xmlns:o="urn:schemas-microsoft-com:office:office" xmlns:oel="http://schemas.microsoft.com/office/2019/extlst" xmlns:r="http://schemas.openxmlformats.org/officeDocument/2006/relationships" xmlns:m="http://schemas.openxmlformats.org/officeDocument/2006/math" xmlns:v="urn:schemas-microsoft-com:vml" xmlns:wp14="http://schemas.microsoft.com/office/word/2010/wordprocessingDrawing" xmlns:wp="http://schemas.openxmlformats.org/drawingml/2006/wordprocessingDrawing" xmlns:w10="urn:schemas-microsoft-com:office:word" xmlns:w="http://schemas.openxmlformats.org/wordprocessingml/2006/main" xmlns:w14="http://schemas.microsoft.com/office/word/2010/wordml" xmlns:w15="http://schemas.microsoft.com/office/word/2012/wordml" xmlns:w16cex="http://schemas.microsoft.com/office/word/2018/wordml/cex" xmlns:w16cid="http://schemas.microsoft.com/office/word/2016/wordml/cid" xmlns:w16="http://schemas.microsoft.com/office/word/2018/wordml" xmlns:w16du="http://schemas.microsoft.com/office/word/2023/wordml/word16du" xmlns:w16sdtdh="http://schemas.microsoft.com/office/word/2020/wordml/sdtdatahash" xmlns:w16sdtfl="http://schemas.microsoft.com/office/word/2024/wordml/sdtformatlock" xmlns:w16se="http://schemas.microsoft.com/office/word/2015/wordml/symex" xmlns:wpg="http://schemas.microsoft.com/office/word/2010/wordprocessingGroup" xmlns:wpi="http://schemas.microsoft.com/office/word/2010/wordprocessingInk" xmlns:wne="http://schemas.microsoft.com/office/word/2006/wordml" xmlns:wps="http://schemas.microsoft.com/office/word/2010/wordprocessingShape" mc:Ignorable="w14 w15 w16se w16cid w16 w16cex w16sdtdh w16sdtfl w16du wp14"/>
 </file>
 
 <file path=word/styles.xml><?xml version="1.0" encoding="utf-8"?>
@@ -2811,11 +3332,11 @@
       <w:szCs w:val="22"/>
     </w:rPr>
   </w:style>
-  <w:style w:type="paragraph" w:styleId="Ttulo1">
+  <w:style w:type="paragraph" w:styleId="Heading1">
     <w:name w:val="heading 1"/>
     <w:basedOn w:val="Normal"/>
     <w:next w:val="Normal"/>
-    <w:link w:val="Ttulo1Car"/>
+    <w:link w:val="Heading1Char"/>
     <w:uiPriority w:val="9"/>
     <w:qFormat/>
     <w:rsid w:val="5E9105EB"/>
@@ -2832,11 +3353,11 @@
       <w:szCs w:val="40"/>
     </w:rPr>
   </w:style>
-  <w:style w:type="paragraph" w:styleId="Ttulo2">
+  <w:style w:type="paragraph" w:styleId="Heading2">
     <w:name w:val="heading 2"/>
     <w:basedOn w:val="Normal"/>
     <w:next w:val="Normal"/>
-    <w:link w:val="Ttulo2Car"/>
+    <w:link w:val="Heading2Char"/>
     <w:uiPriority w:val="9"/>
     <w:semiHidden/>
     <w:unhideWhenUsed/>
@@ -2855,11 +3376,11 @@
       <w:szCs w:val="32"/>
     </w:rPr>
   </w:style>
-  <w:style w:type="paragraph" w:styleId="Ttulo3">
+  <w:style w:type="paragraph" w:styleId="Heading3">
     <w:name w:val="heading 3"/>
     <w:basedOn w:val="Normal"/>
     <w:next w:val="Normal"/>
-    <w:link w:val="Ttulo3Car"/>
+    <w:link w:val="Heading3Char"/>
     <w:uiPriority w:val="9"/>
     <w:semiHidden/>
     <w:unhideWhenUsed/>
@@ -2878,11 +3399,11 @@
       <w:szCs w:val="28"/>
     </w:rPr>
   </w:style>
-  <w:style w:type="paragraph" w:styleId="Ttulo4">
+  <w:style w:type="paragraph" w:styleId="Heading4">
     <w:name w:val="heading 4"/>
     <w:basedOn w:val="Normal"/>
     <w:next w:val="Normal"/>
-    <w:link w:val="Ttulo4Car"/>
+    <w:link w:val="Heading4Char"/>
     <w:uiPriority w:val="9"/>
     <w:semiHidden/>
     <w:unhideWhenUsed/>
@@ -2903,11 +3424,11 @@
       <w:szCs w:val="24"/>
     </w:rPr>
   </w:style>
-  <w:style w:type="paragraph" w:styleId="Ttulo5">
+  <w:style w:type="paragraph" w:styleId="Heading5">
     <w:name w:val="heading 5"/>
     <w:basedOn w:val="Normal"/>
     <w:next w:val="Normal"/>
-    <w:link w:val="Ttulo5Car"/>
+    <w:link w:val="Heading5Char"/>
     <w:uiPriority w:val="9"/>
     <w:semiHidden/>
     <w:unhideWhenUsed/>
@@ -2926,11 +3447,11 @@
       <w:szCs w:val="24"/>
     </w:rPr>
   </w:style>
-  <w:style w:type="paragraph" w:styleId="Ttulo6">
+  <w:style w:type="paragraph" w:styleId="Heading6">
     <w:name w:val="heading 6"/>
     <w:basedOn w:val="Normal"/>
     <w:next w:val="Normal"/>
-    <w:link w:val="Ttulo6Car"/>
+    <w:link w:val="Heading6Char"/>
     <w:uiPriority w:val="9"/>
     <w:semiHidden/>
     <w:unhideWhenUsed/>
@@ -2951,11 +3472,11 @@
       <w:szCs w:val="24"/>
     </w:rPr>
   </w:style>
-  <w:style w:type="paragraph" w:styleId="Ttulo7">
+  <w:style w:type="paragraph" w:styleId="Heading7">
     <w:name w:val="heading 7"/>
     <w:basedOn w:val="Normal"/>
     <w:next w:val="Normal"/>
-    <w:link w:val="Ttulo7Car"/>
+    <w:link w:val="Heading7Char"/>
     <w:uiPriority w:val="9"/>
     <w:semiHidden/>
     <w:unhideWhenUsed/>
@@ -2974,11 +3495,11 @@
       <w:szCs w:val="24"/>
     </w:rPr>
   </w:style>
-  <w:style w:type="paragraph" w:styleId="Ttulo8">
+  <w:style w:type="paragraph" w:styleId="Heading8">
     <w:name w:val="heading 8"/>
     <w:basedOn w:val="Normal"/>
     <w:next w:val="Normal"/>
-    <w:link w:val="Ttulo8Car"/>
+    <w:link w:val="Heading8Char"/>
     <w:uiPriority w:val="9"/>
     <w:semiHidden/>
     <w:unhideWhenUsed/>
@@ -2999,11 +3520,11 @@
       <w:szCs w:val="24"/>
     </w:rPr>
   </w:style>
-  <w:style w:type="paragraph" w:styleId="Ttulo9">
+  <w:style w:type="paragraph" w:styleId="Heading9">
     <w:name w:val="heading 9"/>
     <w:basedOn w:val="Normal"/>
     <w:next w:val="Normal"/>
-    <w:link w:val="Ttulo9Car"/>
+    <w:link w:val="Heading9Char"/>
     <w:uiPriority w:val="9"/>
     <w:semiHidden/>
     <w:unhideWhenUsed/>
@@ -3022,13 +3543,13 @@
       <w:szCs w:val="24"/>
     </w:rPr>
   </w:style>
-  <w:style w:type="character" w:default="1" w:styleId="Fuentedeprrafopredeter">
+  <w:style w:type="character" w:default="1" w:styleId="DefaultParagraphFont">
     <w:name w:val="Default Paragraph Font"/>
     <w:uiPriority w:val="1"/>
     <w:semiHidden/>
     <w:unhideWhenUsed/>
   </w:style>
-  <w:style w:type="table" w:default="1" w:styleId="Tablanormal">
+  <w:style w:type="table" w:default="1" w:styleId="TableNormal">
     <w:name w:val="Normal Table"/>
     <w:uiPriority w:val="99"/>
     <w:semiHidden/>
@@ -3043,16 +3564,16 @@
       </w:tblCellMar>
     </w:tblPr>
   </w:style>
-  <w:style w:type="numbering" w:default="1" w:styleId="Sinlista">
+  <w:style w:type="numbering" w:default="1" w:styleId="NoList">
     <w:name w:val="No List"/>
     <w:uiPriority w:val="99"/>
     <w:semiHidden/>
     <w:unhideWhenUsed/>
   </w:style>
-  <w:style w:type="character" w:customStyle="1" w:styleId="Ttulo1Car">
-    <w:name w:val="Título 1 Car"/>
-    <w:basedOn w:val="Fuentedeprrafopredeter"/>
-    <w:link w:val="Ttulo1"/>
+  <w:style w:type="character" w:customStyle="1" w:styleId="Heading1Char">
+    <w:name w:val="Heading 1 Char"/>
+    <w:basedOn w:val="DefaultParagraphFont"/>
+    <w:link w:val="Heading1"/>
     <w:uiPriority w:val="9"/>
     <w:rsid w:val="00B330E8"/>
     <w:rPr>
@@ -3062,10 +3583,10 @@
       <w:szCs w:val="40"/>
     </w:rPr>
   </w:style>
-  <w:style w:type="character" w:customStyle="1" w:styleId="Ttulo2Car">
-    <w:name w:val="Título 2 Car"/>
-    <w:basedOn w:val="Fuentedeprrafopredeter"/>
-    <w:link w:val="Ttulo2"/>
+  <w:style w:type="character" w:customStyle="1" w:styleId="Heading2Char">
+    <w:name w:val="Heading 2 Char"/>
+    <w:basedOn w:val="DefaultParagraphFont"/>
+    <w:link w:val="Heading2"/>
     <w:uiPriority w:val="9"/>
     <w:semiHidden/>
     <w:rsid w:val="00B330E8"/>
@@ -3076,10 +3597,10 @@
       <w:szCs w:val="32"/>
     </w:rPr>
   </w:style>
-  <w:style w:type="character" w:customStyle="1" w:styleId="Ttulo3Car">
-    <w:name w:val="Título 3 Car"/>
-    <w:basedOn w:val="Fuentedeprrafopredeter"/>
-    <w:link w:val="Ttulo3"/>
+  <w:style w:type="character" w:customStyle="1" w:styleId="Heading3Char">
+    <w:name w:val="Heading 3 Char"/>
+    <w:basedOn w:val="DefaultParagraphFont"/>
+    <w:link w:val="Heading3"/>
     <w:uiPriority w:val="9"/>
     <w:semiHidden/>
     <w:rsid w:val="00B330E8"/>
@@ -3090,10 +3611,10 @@
       <w:szCs w:val="28"/>
     </w:rPr>
   </w:style>
-  <w:style w:type="character" w:customStyle="1" w:styleId="Ttulo4Car">
-    <w:name w:val="Título 4 Car"/>
-    <w:basedOn w:val="Fuentedeprrafopredeter"/>
-    <w:link w:val="Ttulo4"/>
+  <w:style w:type="character" w:customStyle="1" w:styleId="Heading4Char">
+    <w:name w:val="Heading 4 Char"/>
+    <w:basedOn w:val="DefaultParagraphFont"/>
+    <w:link w:val="Heading4"/>
     <w:uiPriority w:val="9"/>
     <w:semiHidden/>
     <w:rsid w:val="00B330E8"/>
@@ -3104,10 +3625,10 @@
       <w:color w:val="0F4761" w:themeColor="accent1" w:themeShade="BF"/>
     </w:rPr>
   </w:style>
-  <w:style w:type="character" w:customStyle="1" w:styleId="Ttulo5Car">
-    <w:name w:val="Título 5 Car"/>
-    <w:basedOn w:val="Fuentedeprrafopredeter"/>
-    <w:link w:val="Ttulo5"/>
+  <w:style w:type="character" w:customStyle="1" w:styleId="Heading5Char">
+    <w:name w:val="Heading 5 Char"/>
+    <w:basedOn w:val="DefaultParagraphFont"/>
+    <w:link w:val="Heading5"/>
     <w:uiPriority w:val="9"/>
     <w:semiHidden/>
     <w:rsid w:val="00B330E8"/>
@@ -3116,10 +3637,10 @@
       <w:color w:val="0F4761" w:themeColor="accent1" w:themeShade="BF"/>
     </w:rPr>
   </w:style>
-  <w:style w:type="character" w:customStyle="1" w:styleId="Ttulo6Car">
-    <w:name w:val="Título 6 Car"/>
-    <w:basedOn w:val="Fuentedeprrafopredeter"/>
-    <w:link w:val="Ttulo6"/>
+  <w:style w:type="character" w:customStyle="1" w:styleId="Heading6Char">
+    <w:name w:val="Heading 6 Char"/>
+    <w:basedOn w:val="DefaultParagraphFont"/>
+    <w:link w:val="Heading6"/>
     <w:uiPriority w:val="9"/>
     <w:semiHidden/>
     <w:rsid w:val="00B330E8"/>
@@ -3130,10 +3651,10 @@
       <w:color w:val="595959" w:themeColor="text1" w:themeTint="A6"/>
     </w:rPr>
   </w:style>
-  <w:style w:type="character" w:customStyle="1" w:styleId="Ttulo7Car">
-    <w:name w:val="Título 7 Car"/>
-    <w:basedOn w:val="Fuentedeprrafopredeter"/>
-    <w:link w:val="Ttulo7"/>
+  <w:style w:type="character" w:customStyle="1" w:styleId="Heading7Char">
+    <w:name w:val="Heading 7 Char"/>
+    <w:basedOn w:val="DefaultParagraphFont"/>
+    <w:link w:val="Heading7"/>
     <w:uiPriority w:val="9"/>
     <w:semiHidden/>
     <w:rsid w:val="00B330E8"/>
@@ -3142,10 +3663,10 @@
       <w:color w:val="595959" w:themeColor="text1" w:themeTint="A6"/>
     </w:rPr>
   </w:style>
-  <w:style w:type="character" w:customStyle="1" w:styleId="Ttulo8Car">
-    <w:name w:val="Título 8 Car"/>
-    <w:basedOn w:val="Fuentedeprrafopredeter"/>
-    <w:link w:val="Ttulo8"/>
+  <w:style w:type="character" w:customStyle="1" w:styleId="Heading8Char">
+    <w:name w:val="Heading 8 Char"/>
+    <w:basedOn w:val="DefaultParagraphFont"/>
+    <w:link w:val="Heading8"/>
     <w:uiPriority w:val="9"/>
     <w:semiHidden/>
     <w:rsid w:val="00B330E8"/>
@@ -3156,10 +3677,10 @@
       <w:color w:val="272727"/>
     </w:rPr>
   </w:style>
-  <w:style w:type="character" w:customStyle="1" w:styleId="Ttulo9Car">
-    <w:name w:val="Título 9 Car"/>
-    <w:basedOn w:val="Fuentedeprrafopredeter"/>
-    <w:link w:val="Ttulo9"/>
+  <w:style w:type="character" w:customStyle="1" w:styleId="Heading9Char">
+    <w:name w:val="Heading 9 Char"/>
+    <w:basedOn w:val="DefaultParagraphFont"/>
+    <w:link w:val="Heading9"/>
     <w:uiPriority w:val="9"/>
     <w:semiHidden/>
     <w:rsid w:val="00B330E8"/>
@@ -3168,11 +3689,11 @@
       <w:color w:val="272727"/>
     </w:rPr>
   </w:style>
-  <w:style w:type="paragraph" w:styleId="Ttulo">
+  <w:style w:type="paragraph" w:styleId="Title">
     <w:name w:val="Title"/>
     <w:basedOn w:val="Normal"/>
     <w:next w:val="Normal"/>
-    <w:link w:val="TtuloCar"/>
+    <w:link w:val="TitleChar"/>
     <w:uiPriority w:val="10"/>
     <w:qFormat/>
     <w:rsid w:val="5E9105EB"/>
@@ -3186,10 +3707,10 @@
       <w:szCs w:val="56"/>
     </w:rPr>
   </w:style>
-  <w:style w:type="character" w:customStyle="1" w:styleId="TtuloCar">
-    <w:name w:val="Título Car"/>
-    <w:basedOn w:val="Fuentedeprrafopredeter"/>
-    <w:link w:val="Ttulo"/>
+  <w:style w:type="character" w:customStyle="1" w:styleId="TitleChar">
+    <w:name w:val="Title Char"/>
+    <w:basedOn w:val="DefaultParagraphFont"/>
+    <w:link w:val="Title"/>
     <w:uiPriority w:val="10"/>
     <w:rsid w:val="00B330E8"/>
     <w:rPr>
@@ -3198,11 +3719,11 @@
       <w:szCs w:val="56"/>
     </w:rPr>
   </w:style>
-  <w:style w:type="paragraph" w:styleId="Subttulo">
+  <w:style w:type="paragraph" w:styleId="Subtitle">
     <w:name w:val="Subtitle"/>
     <w:basedOn w:val="Normal"/>
     <w:next w:val="Normal"/>
-    <w:link w:val="SubttuloCar"/>
+    <w:link w:val="SubtitleChar"/>
     <w:uiPriority w:val="11"/>
     <w:qFormat/>
     <w:rsid w:val="5E9105EB"/>
@@ -3216,10 +3737,10 @@
       <w:szCs w:val="28"/>
     </w:rPr>
   </w:style>
-  <w:style w:type="character" w:customStyle="1" w:styleId="SubttuloCar">
-    <w:name w:val="Subtítulo Car"/>
-    <w:basedOn w:val="Fuentedeprrafopredeter"/>
-    <w:link w:val="Subttulo"/>
+  <w:style w:type="character" w:customStyle="1" w:styleId="SubtitleChar">
+    <w:name w:val="Subtitle Char"/>
+    <w:basedOn w:val="DefaultParagraphFont"/>
+    <w:link w:val="Subtitle"/>
     <w:uiPriority w:val="11"/>
     <w:rsid w:val="00B330E8"/>
     <w:rPr>
@@ -3229,11 +3750,11 @@
       <w:szCs w:val="28"/>
     </w:rPr>
   </w:style>
-  <w:style w:type="paragraph" w:styleId="Cita">
+  <w:style w:type="paragraph" w:styleId="Quote">
     <w:name w:val="Quote"/>
     <w:basedOn w:val="Normal"/>
     <w:next w:val="Normal"/>
-    <w:link w:val="CitaCar"/>
+    <w:link w:val="QuoteChar"/>
     <w:uiPriority w:val="29"/>
     <w:qFormat/>
     <w:rsid w:val="5E9105EB"/>
@@ -3249,10 +3770,10 @@
       <w:szCs w:val="24"/>
     </w:rPr>
   </w:style>
-  <w:style w:type="character" w:customStyle="1" w:styleId="CitaCar">
-    <w:name w:val="Cita Car"/>
-    <w:basedOn w:val="Fuentedeprrafopredeter"/>
-    <w:link w:val="Cita"/>
+  <w:style w:type="character" w:customStyle="1" w:styleId="QuoteChar">
+    <w:name w:val="Quote Char"/>
+    <w:basedOn w:val="DefaultParagraphFont"/>
+    <w:link w:val="Quote"/>
     <w:uiPriority w:val="29"/>
     <w:rsid w:val="00B330E8"/>
     <w:rPr>
@@ -3261,7 +3782,7 @@
       <w:color w:val="404040" w:themeColor="text1" w:themeTint="BF"/>
     </w:rPr>
   </w:style>
-  <w:style w:type="paragraph" w:styleId="Prrafodelista">
+  <w:style w:type="paragraph" w:styleId="ListParagraph">
     <w:name w:val="List Paragraph"/>
     <w:basedOn w:val="Normal"/>
     <w:uiPriority w:val="34"/>
@@ -3277,9 +3798,9 @@
       <w:szCs w:val="24"/>
     </w:rPr>
   </w:style>
-  <w:style w:type="character" w:styleId="nfasisintenso">
+  <w:style w:type="character" w:styleId="IntenseEmphasis">
     <w:name w:val="Intense Emphasis"/>
-    <w:basedOn w:val="Fuentedeprrafopredeter"/>
+    <w:basedOn w:val="DefaultParagraphFont"/>
     <w:uiPriority w:val="21"/>
     <w:qFormat/>
     <w:rsid w:val="00B330E8"/>
@@ -3289,11 +3810,11 @@
       <w:color w:val="0F4761" w:themeColor="accent1" w:themeShade="BF"/>
     </w:rPr>
   </w:style>
-  <w:style w:type="paragraph" w:styleId="Citadestacada">
+  <w:style w:type="paragraph" w:styleId="IntenseQuote">
     <w:name w:val="Intense Quote"/>
     <w:basedOn w:val="Normal"/>
     <w:next w:val="Normal"/>
-    <w:link w:val="CitadestacadaCar"/>
+    <w:link w:val="IntenseQuoteChar"/>
     <w:uiPriority w:val="30"/>
     <w:qFormat/>
     <w:rsid w:val="5E9105EB"/>
@@ -3314,10 +3835,10 @@
       <w:szCs w:val="24"/>
     </w:rPr>
   </w:style>
-  <w:style w:type="character" w:customStyle="1" w:styleId="CitadestacadaCar">
-    <w:name w:val="Cita destacada Car"/>
-    <w:basedOn w:val="Fuentedeprrafopredeter"/>
-    <w:link w:val="Citadestacada"/>
+  <w:style w:type="character" w:customStyle="1" w:styleId="IntenseQuoteChar">
+    <w:name w:val="Intense Quote Char"/>
+    <w:basedOn w:val="DefaultParagraphFont"/>
+    <w:link w:val="IntenseQuote"/>
     <w:uiPriority w:val="30"/>
     <w:rsid w:val="00B330E8"/>
     <w:rPr>
@@ -3326,9 +3847,9 @@
       <w:color w:val="0F4761" w:themeColor="accent1" w:themeShade="BF"/>
     </w:rPr>
   </w:style>
-  <w:style w:type="character" w:styleId="Referenciaintensa">
+  <w:style w:type="character" w:styleId="IntenseReference">
     <w:name w:val="Intense Reference"/>
-    <w:basedOn w:val="Fuentedeprrafopredeter"/>
+    <w:basedOn w:val="DefaultParagraphFont"/>
     <w:uiPriority w:val="32"/>
     <w:qFormat/>
     <w:rsid w:val="00B330E8"/>
@@ -3340,10 +3861,10 @@
       <w:spacing w:val="5"/>
     </w:rPr>
   </w:style>
-  <w:style w:type="paragraph" w:styleId="Encabezado">
+  <w:style w:type="paragraph" w:styleId="Header">
     <w:name w:val="header"/>
     <w:basedOn w:val="Normal"/>
-    <w:link w:val="EncabezadoCar"/>
+    <w:link w:val="HeaderChar"/>
     <w:uiPriority w:val="99"/>
     <w:unhideWhenUsed/>
     <w:rsid w:val="5E9105EB"/>
@@ -3359,17 +3880,17 @@
       <w:szCs w:val="24"/>
     </w:rPr>
   </w:style>
-  <w:style w:type="character" w:customStyle="1" w:styleId="EncabezadoCar">
-    <w:name w:val="Encabezado Car"/>
-    <w:basedOn w:val="Fuentedeprrafopredeter"/>
-    <w:link w:val="Encabezado"/>
+  <w:style w:type="character" w:customStyle="1" w:styleId="HeaderChar">
+    <w:name w:val="Header Char"/>
+    <w:basedOn w:val="DefaultParagraphFont"/>
+    <w:link w:val="Header"/>
     <w:uiPriority w:val="99"/>
     <w:rsid w:val="00B330E8"/>
   </w:style>
-  <w:style w:type="paragraph" w:styleId="Piedepgina">
+  <w:style w:type="paragraph" w:styleId="Footer">
     <w:name w:val="footer"/>
     <w:basedOn w:val="Normal"/>
-    <w:link w:val="PiedepginaCar"/>
+    <w:link w:val="FooterChar"/>
     <w:uiPriority w:val="99"/>
     <w:unhideWhenUsed/>
     <w:rsid w:val="5E9105EB"/>
@@ -3385,16 +3906,16 @@
       <w:szCs w:val="24"/>
     </w:rPr>
   </w:style>
-  <w:style w:type="character" w:customStyle="1" w:styleId="PiedepginaCar">
-    <w:name w:val="Pie de página Car"/>
-    <w:basedOn w:val="Fuentedeprrafopredeter"/>
-    <w:link w:val="Piedepgina"/>
+  <w:style w:type="character" w:customStyle="1" w:styleId="FooterChar">
+    <w:name w:val="Footer Char"/>
+    <w:basedOn w:val="DefaultParagraphFont"/>
+    <w:link w:val="Footer"/>
     <w:uiPriority w:val="99"/>
     <w:rsid w:val="00B330E8"/>
   </w:style>
-  <w:style w:type="table" w:styleId="Tablaconcuadrcula">
+  <w:style w:type="table" w:styleId="TableGrid">
     <w:name w:val="Table Grid"/>
-    <w:basedOn w:val="Tablanormal"/>
+    <w:basedOn w:val="TableNormal"/>
     <w:uiPriority w:val="59"/>
     <w:rsid w:val="00B330E8"/>
     <w:pPr>

</xml_diff>